<commit_message>
Set report font to Times New Roman
Co-Authored-By: Claude Opus 5.5 <noreply@anthropic.com>
Claude-Session: https://claude.ai/code/session_01N7U8VxnPS5UjtBYviPAR3n
</commit_message>
<xml_diff>
--- a/report/Extreme_Events_Final_Report.docx
+++ b/report/Extreme_Events_Final_Report.docx
@@ -91,7 +91,7 @@
       <w:r>
         <w:drawing>
           <wp:inline distT="0" distB="0" distL="0" distR="0">
-            <wp:extent cx="5486400" cy="596347"/>
+            <wp:extent cx="5135270" cy="636422"/>
             <wp:docPr id="901" name="eq1" descr="Equation 1"/>
             <a:graphic xmlns:a="http://schemas.openxmlformats.org/drawingml/2006/main">
               <a:graphicData uri="http://schemas.openxmlformats.org/drawingml/2006/picture">
@@ -109,7 +109,7 @@
                   <pic:spPr>
                     <a:xfrm>
                       <a:off x="0" y="0"/>
-                      <a:ext cx="5486400" cy="596347"/>
+                      <a:ext cx="5135270" cy="636422"/>
                     </a:xfrm>
                     <a:prstGeom prst="rect">
                       <a:avLst/>
@@ -845,7 +845,7 @@
       <w:r>
         <w:drawing>
           <wp:inline distT="0" distB="0" distL="0" distR="0">
-            <wp:extent cx="4740249" cy="574243"/>
+            <wp:extent cx="4411065" cy="574243"/>
             <wp:docPr id="902" name="eq2" descr="Equation 2"/>
             <a:graphic xmlns:a="http://schemas.openxmlformats.org/drawingml/2006/main">
               <a:graphicData uri="http://schemas.openxmlformats.org/drawingml/2006/picture">
@@ -863,7 +863,7 @@
                   <pic:spPr>
                     <a:xfrm>
                       <a:off x="0" y="0"/>
-                      <a:ext cx="4740249" cy="574243"/>
+                      <a:ext cx="4411065" cy="574243"/>
                     </a:xfrm>
                     <a:prstGeom prst="rect">
                       <a:avLst/>
@@ -5486,7 +5486,7 @@
   <w:docDefaults>
     <w:rPrDefault>
       <w:rPr>
-        <w:rFonts w:ascii="Calibri" w:hAnsi="Calibri" w:eastAsia="Calibri" w:cs="Calibri"/>
+        <w:rFonts w:ascii="Times New Roman" w:hAnsi="Times New Roman" w:eastAsia="Times New Roman" w:cs="Times New Roman"/>
         <w:sz w:val="22"/>
         <w:szCs w:val="22"/>
         <w:lang w:val="en-US"/>
@@ -5627,7 +5627,7 @@
       <w:shd w:val="clear" w:color="auto" w:fill="F5F5F5"/>
     </w:pPr>
     <w:rPr>
-      <w:rFonts w:ascii="Consolas" w:hAnsi="Consolas" w:eastAsia="Consolas" w:cs="Consolas"/>
+      <w:rFonts w:ascii="Times New Roman" w:hAnsi="Times New Roman" w:eastAsia="Times New Roman" w:cs="Times New Roman"/>
       <w:sz w:val="20"/>
     </w:rPr>
   </w:style>
@@ -5635,7 +5635,7 @@
     <w:name w:val="Code Char"/>
     <w:link w:val="Code"/>
     <w:rPr>
-      <w:rFonts w:ascii="Consolas" w:hAnsi="Consolas" w:eastAsia="Consolas" w:cs="Consolas"/>
+      <w:rFonts w:ascii="Times New Roman" w:hAnsi="Times New Roman" w:eastAsia="Times New Roman" w:cs="Times New Roman"/>
       <w:sz w:val="20"/>
       <w:shd w:val="clear" w:color="auto" w:fill="F5F5F5"/>
     </w:rPr>

</xml_diff>